<commit_message>
Polish thesis chapter Word draft
</commit_message>
<xml_diff>
--- a/docs/bab-4-5-full.docx
+++ b/docs/bab-4-5-full.docx
@@ -5,18 +5,92 @@
     <w:p>
       <w:pPr>
         <w:jc w:val="center"/>
-        <w:spacing w:after="320"/>
-      </w:pPr>
-      <w:r>
-        <w:rPr>
-          <w:rFonts w:ascii="Times New Roman" w:hAnsi="Times New Roman" w:cs="Times New Roman"/>
-          <w:sz w:val="32"/>
-          <w:sz-cs w:val="32"/>
+        <w:spacing w:after="640"/>
+      </w:pPr>
+      <w:r>
+        <w:rPr>
+          <w:rFonts w:ascii="Times New Roman" w:hAnsi="Times New Roman" w:cs="Times New Roman"/>
+          <w:sz w:val="37"/>
+          <w:sz-cs w:val="37"/>
           <w:b/>
           <w:spacing w:val="0"/>
         </w:rPr>
+        <w:t xml:space="preserve">DRAFT BAB IV DAN BAB V</w:t>
+      </w:r>
+    </w:p>
+    <w:p>
+      <w:pPr>
+        <w:jc w:val="center"/>
+        <w:spacing w:after="480"/>
+      </w:pPr>
+      <w:r>
+        <w:rPr>
+          <w:rFonts w:ascii="Times New Roman" w:hAnsi="Times New Roman" w:cs="Times New Roman"/>
+          <w:sz w:val="32"/>
+          <w:sz-cs w:val="32"/>
+          <w:b/>
+          <w:spacing w:val="0"/>
+        </w:rPr>
+        <w:t xml:space="preserve">Implementasi Metode Pattern Matching pada Chatbot Frequently Asked Questions: SAMSAT Bandung Timur</w:t>
+      </w:r>
+    </w:p>
+    <w:p>
+      <w:pPr>
+        <w:jc w:val="center"/>
+        <w:spacing w:after="266"/>
+      </w:pPr>
+      <w:r>
+        <w:rPr>
+          <w:rFonts w:ascii="Times New Roman" w:hAnsi="Times New Roman" w:cs="Times New Roman"/>
+          <w:sz w:val="32"/>
+          <w:sz-cs w:val="32"/>
+          <w:spacing w:val="0"/>
+        </w:rPr>
+        <w:t xml:space="preserve">Dokumen kerja untuk penyusunan Tugas Akhir</w:t>
+      </w:r>
+    </w:p>
+    <w:p>
+      <w:pPr>
+        <w:jc w:val="center"/>
+        <w:spacing w:after="266"/>
+      </w:pPr>
+      <w:r>
+        <w:rPr>
+          <w:rFonts w:ascii="Times New Roman" w:hAnsi="Times New Roman" w:cs="Times New Roman"/>
+          <w:sz w:val="32"/>
+          <w:sz-cs w:val="32"/>
+          <w:spacing w:val="0"/>
+        </w:rPr>
+        <w:t xml:space="preserve">Format awal: A4, Times New Roman 12, spasi 1.5, margin kiri/atas 4 cm dan kanan/bawah 3 cm</w:t>
+      </w:r>
+    </w:p>
+    <w:p>
+      <w:pPr>
+        <w:jc w:val="center"/>
+      </w:pPr>
+      <w:r>
+        <w:rPr>
+          <w:rFonts w:ascii="Times New Roman" w:hAnsi="Times New Roman" w:cs="Times New Roman"/>
+          <w:sz w:val="32"/>
+          <w:sz-cs w:val="32"/>
+          <w:b/>
+          <w:spacing w:val="0"/>
+        </w:rPr>
         <w:t xml:space="preserve">BAB IV</w:t>
-        <w:br/>
+      </w:r>
+    </w:p>
+    <w:p>
+      <w:pPr>
+        <w:jc w:val="center"/>
+      </w:pPr>
+      <w:r>
+        <w:rPr>
+          <w:rFonts w:ascii="Times New Roman" w:hAnsi="Times New Roman" w:cs="Times New Roman"/>
+          <w:sz w:val="32"/>
+          <w:sz-cs w:val="32"/>
+          <w:b/>
+          <w:spacing w:val="0"/>
+        </w:rPr>
         <w:t xml:space="preserve">IMPLEMENTASI DAN PENGUJIAN</w:t>
       </w:r>
     </w:p>
@@ -136,6 +210,21 @@
     <w:p>
       <w:pPr>
         <w:jc w:val="center"/>
+        <w:spacing w:after="160"/>
+      </w:pPr>
+      <w:r>
+        <w:rPr>
+          <w:rFonts w:ascii="Times New Roman" w:hAnsi="Times New Roman" w:cs="Times New Roman"/>
+          <w:sz w:val="29"/>
+          <w:sz-cs w:val="29"/>
+          <w:spacing w:val="0"/>
+        </w:rPr>
+        <w:t xml:space="preserve">Tabel 4.1 Lingkungan implementasi sistem</w:t>
+      </w:r>
+    </w:p>
+    <w:p>
+      <w:pPr>
+        <w:jc w:val="center"/>
       </w:pPr>
       <w:r>
         <w:rPr>
@@ -479,21 +568,6 @@
           <w:spacing w:val="0"/>
         </w:rPr>
         <w:t xml:space="preserve">Memeriksa fungsi pattern matching, fallback, multi-intent, dan format balasan.</w:t>
-      </w:r>
-    </w:p>
-    <w:p>
-      <w:pPr>
-        <w:jc w:val="center"/>
-        <w:spacing w:after="320"/>
-      </w:pPr>
-      <w:r>
-        <w:rPr>
-          <w:rFonts w:ascii="Times New Roman" w:hAnsi="Times New Roman" w:cs="Times New Roman"/>
-          <w:sz w:val="29"/>
-          <w:sz-cs w:val="29"/>
-          <w:spacing w:val="0"/>
-        </w:rPr>
-        <w:t xml:space="preserve">Tabel 4.1 Lingkungan implementasi sistem</w:t>
       </w:r>
     </w:p>
     <w:p>
@@ -670,7 +744,9 @@
           <w:sz-cs w:val="32"/>
           <w:spacing w:val="0"/>
         </w:rPr>
-        <w:t xml:space="preserve">Tempat Gambar 4.1 Alur kerja chatbot Telegram</w:t>
+        <w:t xml:space="preserve">[Tempat Gambar 4.1]</w:t>
+        <w:br/>
+        <w:t xml:space="preserve">Alur kerja chatbot Telegram</w:t>
       </w:r>
     </w:p>
     <w:p>
@@ -947,6 +1023,21 @@
     <w:p>
       <w:pPr>
         <w:jc w:val="center"/>
+        <w:spacing w:after="160"/>
+      </w:pPr>
+      <w:r>
+        <w:rPr>
+          <w:rFonts w:ascii="Times New Roman" w:hAnsi="Times New Roman" w:cs="Times New Roman"/>
+          <w:sz w:val="29"/>
+          <w:sz-cs w:val="29"/>
+          <w:spacing w:val="0"/>
+        </w:rPr>
+        <w:t xml:space="preserve">Tabel 4.2 Struktur dataset FAQ</w:t>
+      </w:r>
+    </w:p>
+    <w:p>
+      <w:pPr>
+        <w:jc w:val="center"/>
       </w:pPr>
       <w:r>
         <w:rPr>
@@ -1146,33 +1237,33 @@
     </w:p>
     <w:p>
       <w:pPr>
+        <w:jc w:val="both"/>
+        <w:ind w:first-line="960"/>
+        <w:spacing w:after="320"/>
+      </w:pPr>
+      <w:r>
+        <w:rPr>
+          <w:rFonts w:ascii="Times New Roman" w:hAnsi="Times New Roman" w:cs="Times New Roman"/>
+          <w:sz w:val="32"/>
+          <w:sz-cs w:val="32"/>
+          <w:spacing w:val="0"/>
+        </w:rPr>
+        <w:t xml:space="preserve">Dataset dikelompokkan ke dalam sepuluh kategori aktif. Kategori tersebut dipakai pada menu bot dan juga dipakai sebagai salah satu komponen pencocokan saat pengguna mengetik pertanyaan bebas.</w:t>
+      </w:r>
+    </w:p>
+    <w:p>
+      <w:pPr>
         <w:jc w:val="center"/>
-        <w:spacing w:after="320"/>
-      </w:pPr>
-      <w:r>
-        <w:rPr>
-          <w:rFonts w:ascii="Times New Roman" w:hAnsi="Times New Roman" w:cs="Times New Roman"/>
-          <w:sz w:val="29"/>
-          <w:sz-cs w:val="29"/>
-          <w:spacing w:val="0"/>
-        </w:rPr>
-        <w:t xml:space="preserve">Tabel 4.2 Struktur dataset FAQ</w:t>
-      </w:r>
-    </w:p>
-    <w:p>
-      <w:pPr>
-        <w:jc w:val="both"/>
-        <w:ind w:first-line="960"/>
-        <w:spacing w:after="320"/>
-      </w:pPr>
-      <w:r>
-        <w:rPr>
-          <w:rFonts w:ascii="Times New Roman" w:hAnsi="Times New Roman" w:cs="Times New Roman"/>
-          <w:sz w:val="32"/>
-          <w:sz-cs w:val="32"/>
-          <w:spacing w:val="0"/>
-        </w:rPr>
-        <w:t xml:space="preserve">Dataset dikelompokkan ke dalam sepuluh kategori aktif. Kategori tersebut dipakai pada menu bot dan juga dipakai sebagai salah satu komponen pencocokan saat pengguna mengetik pertanyaan bebas.</w:t>
+        <w:spacing w:after="160"/>
+      </w:pPr>
+      <w:r>
+        <w:rPr>
+          <w:rFonts w:ascii="Times New Roman" w:hAnsi="Times New Roman" w:cs="Times New Roman"/>
+          <w:sz w:val="29"/>
+          <w:sz-cs w:val="29"/>
+          <w:spacing w:val="0"/>
+        </w:rPr>
+        <w:t xml:space="preserve">Tabel 4.3 Distribusi dataset FAQ</w:t>
       </w:r>
     </w:p>
     <w:p>
@@ -1578,21 +1669,6 @@
           <w:spacing w:val="0"/>
         </w:rPr>
         <w:t xml:space="preserve">4</w:t>
-      </w:r>
-    </w:p>
-    <w:p>
-      <w:pPr>
-        <w:jc w:val="center"/>
-        <w:spacing w:after="320"/>
-      </w:pPr>
-      <w:r>
-        <w:rPr>
-          <w:rFonts w:ascii="Times New Roman" w:hAnsi="Times New Roman" w:cs="Times New Roman"/>
-          <w:sz w:val="29"/>
-          <w:sz-cs w:val="29"/>
-          <w:spacing w:val="0"/>
-        </w:rPr>
-        <w:t xml:space="preserve">Tabel 4.3 Distribusi dataset FAQ</w:t>
       </w:r>
     </w:p>
     <w:p>
@@ -2828,7 +2904,9 @@
           <w:sz-cs w:val="32"/>
           <w:spacing w:val="0"/>
         </w:rPr>
-        <w:t xml:space="preserve">Tempat Screenshot 4.3 Tampilan awal chatbot setelah /start</w:t>
+        <w:t xml:space="preserve">[Tempat Screenshot 4.3]</w:t>
+        <w:br/>
+        <w:t xml:space="preserve">Tampilan awal chatbot setelah /start</w:t>
       </w:r>
     </w:p>
     <w:p>
@@ -2858,7 +2936,9 @@
           <w:sz-cs w:val="32"/>
           <w:spacing w:val="0"/>
         </w:rPr>
-        <w:t xml:space="preserve">Tempat Screenshot 4.4 Tampilan menu kategori FAQ</w:t>
+        <w:t xml:space="preserve">[Tempat Screenshot 4.4]</w:t>
+        <w:br/>
+        <w:t xml:space="preserve">Tampilan menu kategori FAQ</w:t>
       </w:r>
     </w:p>
     <w:p>
@@ -2888,7 +2968,9 @@
           <w:sz-cs w:val="32"/>
           <w:spacing w:val="0"/>
         </w:rPr>
-        <w:t xml:space="preserve">Tempat Screenshot 4.5 Tampilan jawaban FAQ dan voting</w:t>
+        <w:t xml:space="preserve">[Tempat Screenshot 4.5]</w:t>
+        <w:br/>
+        <w:t xml:space="preserve">Tampilan jawaban FAQ dan voting</w:t>
       </w:r>
     </w:p>
     <w:p>
@@ -2975,6 +3057,21 @@
     <w:p>
       <w:pPr>
         <w:jc w:val="center"/>
+        <w:spacing w:after="160"/>
+      </w:pPr>
+      <w:r>
+        <w:rPr>
+          <w:rFonts w:ascii="Times New Roman" w:hAnsi="Times New Roman" w:cs="Times New Roman"/>
+          <w:sz w:val="29"/>
+          <w:sz-cs w:val="29"/>
+          <w:spacing w:val="0"/>
+        </w:rPr>
+        <w:t xml:space="preserve">Tabel 4.4 Data yang disimpan sistem</w:t>
+      </w:r>
+    </w:p>
+    <w:p>
+      <w:pPr>
+        <w:jc w:val="center"/>
       </w:pPr>
       <w:r>
         <w:rPr>
@@ -3095,95 +3192,125 @@
     </w:p>
     <w:p>
       <w:pPr>
+        <w:jc w:val="both"/>
+        <w:ind w:first-line="960"/>
+        <w:spacing w:after="320"/>
+      </w:pPr>
+      <w:r>
+        <w:rPr>
+          <w:rFonts w:ascii="Times New Roman" w:hAnsi="Times New Roman" w:cs="Times New Roman"/>
+          <w:sz w:val="32"/>
+          <w:sz-cs w:val="32"/>
+          <w:spacing w:val="0"/>
+        </w:rPr>
+        <w:t xml:space="preserve">Endpoint export data riset dilindungi dengan token admin. Dengan begitu, file CSV atau HTML tidak terbuka untuk umum. Data export dipakai untuk melihat responden yang mencoba chatbot dan hasil penilaian mereka terhadap jawaban FAQ.</w:t>
+      </w:r>
+    </w:p>
+    <w:p>
+      <w:pPr>
+        <w:spacing w:after="320"/>
+      </w:pPr>
+      <w:r>
+        <w:rPr>
+          <w:rFonts w:ascii="Times New Roman" w:hAnsi="Times New Roman" w:cs="Times New Roman"/>
+          <w:sz w:val="32"/>
+          <w:sz-cs w:val="32"/>
+          <w:b/>
+          <w:spacing w:val="0"/>
+        </w:rPr>
+        <w:t xml:space="preserve">4.6 Pengujian Sistem</w:t>
+      </w:r>
+    </w:p>
+    <w:p>
+      <w:pPr>
+        <w:jc w:val="both"/>
+        <w:ind w:first-line="960"/>
+        <w:spacing w:after="320"/>
+      </w:pPr>
+      <w:r>
+        <w:rPr>
+          <w:rFonts w:ascii="Times New Roman" w:hAnsi="Times New Roman" w:cs="Times New Roman"/>
+          <w:sz w:val="32"/>
+          <w:sz-cs w:val="32"/>
+          <w:spacing w:val="0"/>
+        </w:rPr>
+        <w:t xml:space="preserve">Pengujian sistem dilakukan lewat dua jalur. Jalur pertama adalah pengujian otomatis menggunakan Vitest. Jalur kedua adalah uji coba langsung melalui Telegram bot. Pengujian otomatis memeriksa fungsi program, sedangkan uji coba Telegram memeriksa pengalaman pengguna pada media implementasi yang sebenarnya.</w:t>
+      </w:r>
+    </w:p>
+    <w:p>
+      <w:pPr>
+        <w:spacing w:after="320"/>
+      </w:pPr>
+      <w:r>
+        <w:rPr>
+          <w:rFonts w:ascii="Times New Roman" w:hAnsi="Times New Roman" w:cs="Times New Roman"/>
+          <w:sz w:val="32"/>
+          <w:sz-cs w:val="32"/>
+          <w:b/>
+          <w:spacing w:val="0"/>
+        </w:rPr>
+        <w:t xml:space="preserve">4.6.1 Black Box Testing</w:t>
+      </w:r>
+    </w:p>
+    <w:p>
+      <w:pPr>
+        <w:jc w:val="both"/>
+        <w:ind w:first-line="960"/>
+        <w:spacing w:after="320"/>
+      </w:pPr>
+      <w:r>
+        <w:rPr>
+          <w:rFonts w:ascii="Times New Roman" w:hAnsi="Times New Roman" w:cs="Times New Roman"/>
+          <w:sz w:val="32"/>
+          <w:sz-cs w:val="32"/>
+          <w:spacing w:val="0"/>
+        </w:rPr>
+        <w:t xml:space="preserve">Pengujian black box dilakukan dengan memberi input kepada chatbot dan membandingkan output dengan hasil yang diharapkan. Penguji tidak perlu melihat detail scoring di dalam fungsi matcher. Yang diperiksa adalah apakah input tertentu menghasilkan FAQ yang benar atau fallback.</w:t>
+      </w:r>
+    </w:p>
+    <w:p>
+      <w:pPr>
         <w:jc w:val="center"/>
-        <w:spacing w:after="320"/>
-      </w:pPr>
-      <w:r>
-        <w:rPr>
-          <w:rFonts w:ascii="Times New Roman" w:hAnsi="Times New Roman" w:cs="Times New Roman"/>
-          <w:sz w:val="29"/>
-          <w:sz-cs w:val="29"/>
-          <w:spacing w:val="0"/>
-        </w:rPr>
-        <w:t xml:space="preserve">Tabel 4.4 Data yang disimpan sistem</w:t>
-      </w:r>
-    </w:p>
-    <w:p>
-      <w:pPr>
-        <w:jc w:val="both"/>
-        <w:ind w:first-line="960"/>
-        <w:spacing w:after="320"/>
-      </w:pPr>
-      <w:r>
-        <w:rPr>
-          <w:rFonts w:ascii="Times New Roman" w:hAnsi="Times New Roman" w:cs="Times New Roman"/>
-          <w:sz w:val="32"/>
-          <w:sz-cs w:val="32"/>
-          <w:spacing w:val="0"/>
-        </w:rPr>
-        <w:t xml:space="preserve">Endpoint export data riset dilindungi dengan token admin. Dengan begitu, file CSV atau HTML tidak terbuka untuk umum. Data export dipakai untuk melihat responden yang mencoba chatbot dan hasil penilaian mereka terhadap jawaban FAQ.</w:t>
-      </w:r>
-    </w:p>
-    <w:p>
-      <w:pPr>
-        <w:spacing w:after="320"/>
-      </w:pPr>
-      <w:r>
-        <w:rPr>
-          <w:rFonts w:ascii="Times New Roman" w:hAnsi="Times New Roman" w:cs="Times New Roman"/>
-          <w:sz w:val="32"/>
-          <w:sz-cs w:val="32"/>
+        <w:spacing w:after="160"/>
+      </w:pPr>
+      <w:r>
+        <w:rPr>
+          <w:rFonts w:ascii="Times New Roman" w:hAnsi="Times New Roman" w:cs="Times New Roman"/>
+          <w:sz w:val="29"/>
+          <w:sz-cs w:val="29"/>
+          <w:spacing w:val="0"/>
+        </w:rPr>
+        <w:t xml:space="preserve">Tabel 4.5 Contoh skenario black box testing</w:t>
+      </w:r>
+    </w:p>
+    <w:p>
+      <w:pPr>
+        <w:jc w:val="center"/>
+      </w:pPr>
+      <w:r>
+        <w:rPr>
+          <w:rFonts w:ascii="Times New Roman" w:hAnsi="Times New Roman" w:cs="Times New Roman"/>
+          <w:sz w:val="29"/>
+          <w:sz-cs w:val="29"/>
           <w:b/>
           <w:spacing w:val="0"/>
         </w:rPr>
-        <w:t xml:space="preserve">4.6 Pengujian Sistem</w:t>
-      </w:r>
-    </w:p>
-    <w:p>
-      <w:pPr>
-        <w:jc w:val="both"/>
-        <w:ind w:first-line="960"/>
-        <w:spacing w:after="320"/>
-      </w:pPr>
-      <w:r>
-        <w:rPr>
-          <w:rFonts w:ascii="Times New Roman" w:hAnsi="Times New Roman" w:cs="Times New Roman"/>
-          <w:sz w:val="32"/>
-          <w:sz-cs w:val="32"/>
-          <w:spacing w:val="0"/>
-        </w:rPr>
-        <w:t xml:space="preserve">Pengujian sistem dilakukan lewat dua jalur. Jalur pertama adalah pengujian otomatis menggunakan Vitest. Jalur kedua adalah uji coba langsung melalui Telegram bot. Pengujian otomatis memeriksa fungsi program, sedangkan uji coba Telegram memeriksa pengalaman pengguna pada media implementasi yang sebenarnya.</w:t>
-      </w:r>
-    </w:p>
-    <w:p>
-      <w:pPr>
-        <w:spacing w:after="320"/>
-      </w:pPr>
-      <w:r>
-        <w:rPr>
-          <w:rFonts w:ascii="Times New Roman" w:hAnsi="Times New Roman" w:cs="Times New Roman"/>
-          <w:sz w:val="32"/>
-          <w:sz-cs w:val="32"/>
+        <w:t xml:space="preserve">No</w:t>
+      </w:r>
+    </w:p>
+    <w:p>
+      <w:pPr>
+        <w:jc w:val="center"/>
+      </w:pPr>
+      <w:r>
+        <w:rPr>
+          <w:rFonts w:ascii="Times New Roman" w:hAnsi="Times New Roman" w:cs="Times New Roman"/>
+          <w:sz w:val="29"/>
+          <w:sz-cs w:val="29"/>
           <w:b/>
           <w:spacing w:val="0"/>
         </w:rPr>
-        <w:t xml:space="preserve">4.6.1 Black Box Testing</w:t>
-      </w:r>
-    </w:p>
-    <w:p>
-      <w:pPr>
-        <w:jc w:val="both"/>
-        <w:ind w:first-line="960"/>
-        <w:spacing w:after="320"/>
-      </w:pPr>
-      <w:r>
-        <w:rPr>
-          <w:rFonts w:ascii="Times New Roman" w:hAnsi="Times New Roman" w:cs="Times New Roman"/>
-          <w:sz w:val="32"/>
-          <w:sz-cs w:val="32"/>
-          <w:spacing w:val="0"/>
-        </w:rPr>
-        <w:t xml:space="preserve">Pengujian black box dilakukan dengan memberi input kepada chatbot dan membandingkan output dengan hasil yang diharapkan. Penguji tidak perlu melihat detail scoring di dalam fungsi matcher. Yang diperiksa adalah apakah input tertentu menghasilkan FAQ yang benar atau fallback.</w:t>
+        <w:t xml:space="preserve">Skenario</w:t>
       </w:r>
     </w:p>
     <w:p>
@@ -3198,7 +3325,7 @@
           <w:b/>
           <w:spacing w:val="0"/>
         </w:rPr>
-        <w:t xml:space="preserve">No</w:t>
+        <w:t xml:space="preserve">Input</w:t>
       </w:r>
     </w:p>
     <w:p>
@@ -3213,36 +3340,6 @@
           <w:b/>
           <w:spacing w:val="0"/>
         </w:rPr>
-        <w:t xml:space="preserve">Skenario</w:t>
-      </w:r>
-    </w:p>
-    <w:p>
-      <w:pPr>
-        <w:jc w:val="center"/>
-      </w:pPr>
-      <w:r>
-        <w:rPr>
-          <w:rFonts w:ascii="Times New Roman" w:hAnsi="Times New Roman" w:cs="Times New Roman"/>
-          <w:sz w:val="29"/>
-          <w:sz-cs w:val="29"/>
-          <w:b/>
-          <w:spacing w:val="0"/>
-        </w:rPr>
-        <w:t xml:space="preserve">Input</w:t>
-      </w:r>
-    </w:p>
-    <w:p>
-      <w:pPr>
-        <w:jc w:val="center"/>
-      </w:pPr>
-      <w:r>
-        <w:rPr>
-          <w:rFonts w:ascii="Times New Roman" w:hAnsi="Times New Roman" w:cs="Times New Roman"/>
-          <w:sz w:val="29"/>
-          <w:sz-cs w:val="29"/>
-          <w:b/>
-          <w:spacing w:val="0"/>
-        </w:rPr>
         <w:t xml:space="preserve">Output yang Diharapkan</w:t>
       </w:r>
     </w:p>
@@ -3484,21 +3581,6 @@
           <w:spacing w:val="0"/>
         </w:rPr>
         <w:t xml:space="preserve">Fallback.</w:t>
-      </w:r>
-    </w:p>
-    <w:p>
-      <w:pPr>
-        <w:jc w:val="center"/>
-        <w:spacing w:after="320"/>
-      </w:pPr>
-      <w:r>
-        <w:rPr>
-          <w:rFonts w:ascii="Times New Roman" w:hAnsi="Times New Roman" w:cs="Times New Roman"/>
-          <w:sz w:val="29"/>
-          <w:sz-cs w:val="29"/>
-          <w:spacing w:val="0"/>
-        </w:rPr>
-        <w:t xml:space="preserve">Tabel 4.5 Contoh skenario black box testing</w:t>
       </w:r>
     </w:p>
     <w:p>
@@ -3671,6 +3753,21 @@
     <w:p>
       <w:pPr>
         <w:jc w:val="center"/>
+        <w:spacing w:after="160"/>
+      </w:pPr>
+      <w:r>
+        <w:rPr>
+          <w:rFonts w:ascii="Times New Roman" w:hAnsi="Times New Roman" w:cs="Times New Roman"/>
+          <w:sz w:val="29"/>
+          <w:sz-cs w:val="29"/>
+          <w:spacing w:val="0"/>
+        </w:rPr>
+        <w:t xml:space="preserve">Tabel 4.6 Hasil pengujian otomatis</w:t>
+      </w:r>
+    </w:p>
+    <w:p>
+      <w:pPr>
+        <w:jc w:val="center"/>
       </w:pPr>
       <w:r>
         <w:rPr>
@@ -3823,54 +3920,194 @@
     </w:p>
     <w:p>
       <w:pPr>
+        <w:jc w:val="both"/>
+        <w:ind w:first-line="960"/>
+        <w:spacing w:after="320"/>
+      </w:pPr>
+      <w:r>
+        <w:rPr>
+          <w:rFonts w:ascii="Times New Roman" w:hAnsi="Times New Roman" w:cs="Times New Roman"/>
+          <w:sz w:val="32"/>
+          <w:sz-cs w:val="32"/>
+          <w:spacing w:val="0"/>
+        </w:rPr>
+        <w:t xml:space="preserve">Pengujian pertanyaan resmi memastikan bahwa pertanyaan utama pada dataset tetap mengarah ke FAQ asalnya. Pengujian variasi kalimat memastikan bahwa pertanyaan dengan susunan kata berbeda tetap dikenali. Pengujian fallback memastikan bot tidak menjawab pertanyaan di luar konteks SAMSAT, seperti paspor, ATM, listrik, atau layanan lain yang tidak termasuk administrasi kendaraan.</w:t>
+      </w:r>
+    </w:p>
+    <w:p>
+      <w:pPr>
+        <w:jc w:val="both"/>
+        <w:ind w:first-line="960"/>
+        <w:spacing w:after="320"/>
+      </w:pPr>
+      <w:r>
+        <w:rPr>
+          <w:rFonts w:ascii="Times New Roman" w:hAnsi="Times New Roman" w:cs="Times New Roman"/>
+          <w:sz w:val="32"/>
+          <w:sz-cs w:val="32"/>
+          <w:spacing w:val="0"/>
+        </w:rPr>
+        <w:t xml:space="preserve">Hasil uji coba Telegram dapat ditambahkan setelah responden mencoba bot. Data yang perlu dimasukkan antara lain jumlah responden, contoh pertanyaan yang diajukan, dan rekap voting Memuaskan atau Tidak Memuaskan.</w:t>
+      </w:r>
+    </w:p>
+    <w:p>
+      <w:pPr>
+        <w:spacing w:after="320"/>
+      </w:pPr>
+      <w:r>
+        <w:rPr>
+          <w:rFonts w:ascii="Times New Roman" w:hAnsi="Times New Roman" w:cs="Times New Roman"/>
+          <w:sz w:val="32"/>
+          <w:sz-cs w:val="32"/>
+          <w:b/>
+          <w:spacing w:val="0"/>
+        </w:rPr>
+        <w:t xml:space="preserve">4.8 Analisis Hasil</w:t>
+      </w:r>
+    </w:p>
+    <w:p>
+      <w:pPr>
+        <w:jc w:val="both"/>
+        <w:ind w:first-line="960"/>
+        <w:spacing w:after="320"/>
+      </w:pPr>
+      <w:r>
+        <w:rPr>
+          <w:rFonts w:ascii="Times New Roman" w:hAnsi="Times New Roman" w:cs="Times New Roman"/>
+          <w:sz w:val="32"/>
+          <w:sz-cs w:val="32"/>
+          <w:spacing w:val="0"/>
+        </w:rPr>
+        <w:t xml:space="preserve">Berdasarkan hasil pengujian, sistem mampu mencocokkan pertanyaan pengguna dengan FAQ yang relevan jika input masih memiliki kata kunci, pola frasa, atau konteks yang sudah diwakili dalam dataset. Pertanyaan seperti </w:t>
+      </w:r>
+      <w:r>
+        <w:rPr>
+          <w:rFonts w:ascii="Times New Roman" w:hAnsi="Times New Roman" w:cs="Times New Roman"/>
+          <w:sz w:val="32"/>
+          <w:sz-cs w:val="32"/>
+          <w:i/>
+          <w:spacing w:val="0"/>
+        </w:rPr>
+        <w:t xml:space="preserve">Kalau STNK hilang bagaimana?</w:t>
+      </w:r>
+      <w:r>
+        <w:rPr>
+          <w:rFonts w:ascii="Times New Roman" w:hAnsi="Times New Roman" w:cs="Times New Roman"/>
+          <w:sz w:val="32"/>
+          <w:sz-cs w:val="32"/>
+          <w:spacing w:val="0"/>
+        </w:rPr>
+        <w:t xml:space="preserve"> tetap dikenali karena pola STNK hilang sudah diwakili oleh custom pattern dan regex pendukung.</w:t>
+      </w:r>
+    </w:p>
+    <w:p>
+      <w:pPr>
+        <w:jc w:val="both"/>
+        <w:ind w:first-line="960"/>
+        <w:spacing w:after="320"/>
+      </w:pPr>
+      <w:r>
+        <w:rPr>
+          <w:rFonts w:ascii="Times New Roman" w:hAnsi="Times New Roman" w:cs="Times New Roman"/>
+          <w:sz w:val="32"/>
+          <w:sz-cs w:val="32"/>
+          <w:spacing w:val="0"/>
+        </w:rPr>
+        <w:t xml:space="preserve">Regex membantu sistem pada istilah yang memiliki banyak variasi penulisan. Contohnya, </w:t>
+      </w:r>
+      <w:r>
+        <w:rPr>
+          <w:rFonts w:ascii="Times New Roman" w:hAnsi="Times New Roman" w:cs="Times New Roman"/>
+          <w:sz w:val="32"/>
+          <w:sz-cs w:val="32"/>
+          <w:i/>
+          <w:spacing w:val="0"/>
+        </w:rPr>
+        <w:t xml:space="preserve">5 tahunan</w:t>
+      </w:r>
+      <w:r>
+        <w:rPr>
+          <w:rFonts w:ascii="Times New Roman" w:hAnsi="Times New Roman" w:cs="Times New Roman"/>
+          <w:sz w:val="32"/>
+          <w:sz-cs w:val="32"/>
+          <w:spacing w:val="0"/>
+        </w:rPr>
+        <w:t xml:space="preserve">, </w:t>
+      </w:r>
+      <w:r>
+        <w:rPr>
+          <w:rFonts w:ascii="Times New Roman" w:hAnsi="Times New Roman" w:cs="Times New Roman"/>
+          <w:sz w:val="32"/>
+          <w:sz-cs w:val="32"/>
+          <w:i/>
+          <w:spacing w:val="0"/>
+        </w:rPr>
+        <w:t xml:space="preserve">lima tahun</w:t>
+      </w:r>
+      <w:r>
+        <w:rPr>
+          <w:rFonts w:ascii="Times New Roman" w:hAnsi="Times New Roman" w:cs="Times New Roman"/>
+          <w:sz w:val="32"/>
+          <w:sz-cs w:val="32"/>
+          <w:spacing w:val="0"/>
+        </w:rPr>
+        <w:t xml:space="preserve">, dan </w:t>
+      </w:r>
+      <w:r>
+        <w:rPr>
+          <w:rFonts w:ascii="Times New Roman" w:hAnsi="Times New Roman" w:cs="Times New Roman"/>
+          <w:sz w:val="32"/>
+          <w:sz-cs w:val="32"/>
+          <w:i/>
+          <w:spacing w:val="0"/>
+        </w:rPr>
+        <w:t xml:space="preserve">ganti plat</w:t>
+      </w:r>
+      <w:r>
+        <w:rPr>
+          <w:rFonts w:ascii="Times New Roman" w:hAnsi="Times New Roman" w:cs="Times New Roman"/>
+          <w:sz w:val="32"/>
+          <w:sz-cs w:val="32"/>
+          <w:spacing w:val="0"/>
+        </w:rPr>
+        <w:t xml:space="preserve"> dapat diarahkan ke konteks pajak lima tahunan. Custom pattern membantu pertanyaan yang lebih natural, misalnya pertanyaan tentang pemilik kendaraan yang sudah meninggal atau kendaraan luar daerah yang ingin dimutasi ke Bandung.</w:t>
+      </w:r>
+    </w:p>
+    <w:p>
+      <w:pPr>
+        <w:jc w:val="both"/>
+        <w:ind w:first-line="960"/>
+        <w:spacing w:after="320"/>
+      </w:pPr>
+      <w:r>
+        <w:rPr>
+          <w:rFonts w:ascii="Times New Roman" w:hAnsi="Times New Roman" w:cs="Times New Roman"/>
+          <w:sz w:val="32"/>
+          <w:sz-cs w:val="32"/>
+          <w:spacing w:val="0"/>
+        </w:rPr>
+        <w:t xml:space="preserve">Fallback juga bekerja sebagai pembatas domain. Saat pengguna bertanya tentang paspor, ATM, listrik, SIM, atau perbaikan motor, bot tidak memaksakan jawaban dari dataset SAMSAT. Ini penting karena pattern matching berbasis aturan bisa salah memilih jawaban jika tidak diberi pembatas konteks.</w:t>
+      </w:r>
+    </w:p>
+    <w:p>
+      <w:pPr>
+        <w:jc w:val="both"/>
+        <w:ind w:first-line="960"/>
+        <w:spacing w:after="320"/>
+      </w:pPr>
+      <w:r>
+        <w:rPr>
+          <w:rFonts w:ascii="Times New Roman" w:hAnsi="Times New Roman" w:cs="Times New Roman"/>
+          <w:sz w:val="32"/>
+          <w:sz-cs w:val="32"/>
+          <w:spacing w:val="0"/>
+        </w:rPr>
+        <w:t xml:space="preserve">Keterbatasan sistem tetap ada. Bot tidak memahami semua variasi bahasa seperti AI generatif. Jika pengguna menulis pertanyaan dengan pola yang belum pernah diwakili oleh dataset, custom pattern, atau regex, bot bisa mengirim fallback. Kondisi tersebut menjadi dasar untuk memperbarui dataset dan menambah regression test pada pengembangan berikutnya.</w:t>
+      </w:r>
+    </w:p>
+    <w:p>
+      <w:pPr>
         <w:jc w:val="center"/>
-        <w:spacing w:after="320"/>
-      </w:pPr>
-      <w:r>
-        <w:rPr>
-          <w:rFonts w:ascii="Times New Roman" w:hAnsi="Times New Roman" w:cs="Times New Roman"/>
-          <w:sz w:val="29"/>
-          <w:sz-cs w:val="29"/>
-          <w:spacing w:val="0"/>
-        </w:rPr>
-        <w:t xml:space="preserve">Tabel 4.6 Hasil pengujian otomatis</w:t>
-      </w:r>
-    </w:p>
-    <w:p>
-      <w:pPr>
-        <w:jc w:val="both"/>
-        <w:ind w:first-line="960"/>
-        <w:spacing w:after="320"/>
-      </w:pPr>
-      <w:r>
-        <w:rPr>
-          <w:rFonts w:ascii="Times New Roman" w:hAnsi="Times New Roman" w:cs="Times New Roman"/>
-          <w:sz w:val="32"/>
-          <w:sz-cs w:val="32"/>
-          <w:spacing w:val="0"/>
-        </w:rPr>
-        <w:t xml:space="preserve">Pengujian pertanyaan resmi memastikan bahwa pertanyaan utama pada dataset tetap mengarah ke FAQ asalnya. Pengujian variasi kalimat memastikan bahwa pertanyaan dengan susunan kata berbeda tetap dikenali. Pengujian fallback memastikan bot tidak menjawab pertanyaan di luar konteks SAMSAT, seperti paspor, ATM, listrik, atau layanan lain yang tidak termasuk administrasi kendaraan.</w:t>
-      </w:r>
-    </w:p>
-    <w:p>
-      <w:pPr>
-        <w:jc w:val="both"/>
-        <w:ind w:first-line="960"/>
-        <w:spacing w:after="320"/>
-      </w:pPr>
-      <w:r>
-        <w:rPr>
-          <w:rFonts w:ascii="Times New Roman" w:hAnsi="Times New Roman" w:cs="Times New Roman"/>
-          <w:sz w:val="32"/>
-          <w:sz-cs w:val="32"/>
-          <w:spacing w:val="0"/>
-        </w:rPr>
-        <w:t xml:space="preserve">Hasil uji coba Telegram dapat ditambahkan setelah responden mencoba bot. Data yang perlu dimasukkan antara lain jumlah responden, contoh pertanyaan yang diajukan, dan rekap voting Memuaskan atau Tidak Memuaskan.</w:t>
-      </w:r>
-    </w:p>
-    <w:p>
-      <w:pPr>
-        <w:spacing w:after="320"/>
       </w:pPr>
       <w:r>
         <w:rPr>
@@ -3880,153 +4117,12 @@
           <w:b/>
           <w:spacing w:val="0"/>
         </w:rPr>
-        <w:t xml:space="preserve">4.8 Analisis Hasil</w:t>
-      </w:r>
-    </w:p>
-    <w:p>
-      <w:pPr>
-        <w:jc w:val="both"/>
-        <w:ind w:first-line="960"/>
-        <w:spacing w:after="320"/>
-      </w:pPr>
-      <w:r>
-        <w:rPr>
-          <w:rFonts w:ascii="Times New Roman" w:hAnsi="Times New Roman" w:cs="Times New Roman"/>
-          <w:sz w:val="32"/>
-          <w:sz-cs w:val="32"/>
-          <w:spacing w:val="0"/>
-        </w:rPr>
-        <w:t xml:space="preserve">Berdasarkan hasil pengujian, sistem mampu mencocokkan pertanyaan pengguna dengan FAQ yang relevan jika input masih memiliki kata kunci, pola frasa, atau konteks yang sudah diwakili dalam dataset. Pertanyaan seperti </w:t>
-      </w:r>
-      <w:r>
-        <w:rPr>
-          <w:rFonts w:ascii="Times New Roman" w:hAnsi="Times New Roman" w:cs="Times New Roman"/>
-          <w:sz w:val="32"/>
-          <w:sz-cs w:val="32"/>
-          <w:i/>
-          <w:spacing w:val="0"/>
-        </w:rPr>
-        <w:t xml:space="preserve">Kalau STNK hilang bagaimana?</w:t>
-      </w:r>
-      <w:r>
-        <w:rPr>
-          <w:rFonts w:ascii="Times New Roman" w:hAnsi="Times New Roman" w:cs="Times New Roman"/>
-          <w:sz w:val="32"/>
-          <w:sz-cs w:val="32"/>
-          <w:spacing w:val="0"/>
-        </w:rPr>
-        <w:t xml:space="preserve"> tetap dikenali karena pola STNK hilang sudah diwakili oleh custom pattern dan regex pendukung.</w:t>
-      </w:r>
-    </w:p>
-    <w:p>
-      <w:pPr>
-        <w:jc w:val="both"/>
-        <w:ind w:first-line="960"/>
-        <w:spacing w:after="320"/>
-      </w:pPr>
-      <w:r>
-        <w:rPr>
-          <w:rFonts w:ascii="Times New Roman" w:hAnsi="Times New Roman" w:cs="Times New Roman"/>
-          <w:sz w:val="32"/>
-          <w:sz-cs w:val="32"/>
-          <w:spacing w:val="0"/>
-        </w:rPr>
-        <w:t xml:space="preserve">Regex membantu sistem pada istilah yang memiliki banyak variasi penulisan. Contohnya, </w:t>
-      </w:r>
-      <w:r>
-        <w:rPr>
-          <w:rFonts w:ascii="Times New Roman" w:hAnsi="Times New Roman" w:cs="Times New Roman"/>
-          <w:sz w:val="32"/>
-          <w:sz-cs w:val="32"/>
-          <w:i/>
-          <w:spacing w:val="0"/>
-        </w:rPr>
-        <w:t xml:space="preserve">5 tahunan</w:t>
-      </w:r>
-      <w:r>
-        <w:rPr>
-          <w:rFonts w:ascii="Times New Roman" w:hAnsi="Times New Roman" w:cs="Times New Roman"/>
-          <w:sz w:val="32"/>
-          <w:sz-cs w:val="32"/>
-          <w:spacing w:val="0"/>
-        </w:rPr>
-        <w:t xml:space="preserve">, </w:t>
-      </w:r>
-      <w:r>
-        <w:rPr>
-          <w:rFonts w:ascii="Times New Roman" w:hAnsi="Times New Roman" w:cs="Times New Roman"/>
-          <w:sz w:val="32"/>
-          <w:sz-cs w:val="32"/>
-          <w:i/>
-          <w:spacing w:val="0"/>
-        </w:rPr>
-        <w:t xml:space="preserve">lima tahun</w:t>
-      </w:r>
-      <w:r>
-        <w:rPr>
-          <w:rFonts w:ascii="Times New Roman" w:hAnsi="Times New Roman" w:cs="Times New Roman"/>
-          <w:sz w:val="32"/>
-          <w:sz-cs w:val="32"/>
-          <w:spacing w:val="0"/>
-        </w:rPr>
-        <w:t xml:space="preserve">, dan </w:t>
-      </w:r>
-      <w:r>
-        <w:rPr>
-          <w:rFonts w:ascii="Times New Roman" w:hAnsi="Times New Roman" w:cs="Times New Roman"/>
-          <w:sz w:val="32"/>
-          <w:sz-cs w:val="32"/>
-          <w:i/>
-          <w:spacing w:val="0"/>
-        </w:rPr>
-        <w:t xml:space="preserve">ganti plat</w:t>
-      </w:r>
-      <w:r>
-        <w:rPr>
-          <w:rFonts w:ascii="Times New Roman" w:hAnsi="Times New Roman" w:cs="Times New Roman"/>
-          <w:sz w:val="32"/>
-          <w:sz-cs w:val="32"/>
-          <w:spacing w:val="0"/>
-        </w:rPr>
-        <w:t xml:space="preserve"> dapat diarahkan ke konteks pajak lima tahunan. Custom pattern membantu pertanyaan yang lebih natural, misalnya pertanyaan tentang pemilik kendaraan yang sudah meninggal atau kendaraan luar daerah yang ingin dimutasi ke Bandung.</w:t>
-      </w:r>
-    </w:p>
-    <w:p>
-      <w:pPr>
-        <w:jc w:val="both"/>
-        <w:ind w:first-line="960"/>
-        <w:spacing w:after="320"/>
-      </w:pPr>
-      <w:r>
-        <w:rPr>
-          <w:rFonts w:ascii="Times New Roman" w:hAnsi="Times New Roman" w:cs="Times New Roman"/>
-          <w:sz w:val="32"/>
-          <w:sz-cs w:val="32"/>
-          <w:spacing w:val="0"/>
-        </w:rPr>
-        <w:t xml:space="preserve">Fallback juga bekerja sebagai pembatas domain. Saat pengguna bertanya tentang paspor, ATM, listrik, SIM, atau perbaikan motor, bot tidak memaksakan jawaban dari dataset SAMSAT. Ini penting karena pattern matching berbasis aturan bisa salah memilih jawaban jika tidak diberi pembatas konteks.</w:t>
-      </w:r>
-    </w:p>
-    <w:p>
-      <w:pPr>
-        <w:jc w:val="both"/>
-        <w:ind w:first-line="960"/>
-        <w:spacing w:after="320"/>
-      </w:pPr>
-      <w:r>
-        <w:rPr>
-          <w:rFonts w:ascii="Times New Roman" w:hAnsi="Times New Roman" w:cs="Times New Roman"/>
-          <w:sz w:val="32"/>
-          <w:sz-cs w:val="32"/>
-          <w:spacing w:val="0"/>
-        </w:rPr>
-        <w:t xml:space="preserve">Keterbatasan sistem tetap ada. Bot tidak memahami semua variasi bahasa seperti AI generatif. Jika pengguna menulis pertanyaan dengan pola yang belum pernah diwakili oleh dataset, custom pattern, atau regex, bot bisa mengirim fallback. Kondisi tersebut menjadi dasar untuk memperbarui dataset dan menambah regression test pada pengembangan berikutnya.</w:t>
+        <w:t xml:space="preserve">BAB V</w:t>
       </w:r>
     </w:p>
     <w:p>
       <w:pPr>
         <w:jc w:val="center"/>
-        <w:spacing w:after="320"/>
       </w:pPr>
       <w:r>
         <w:rPr>
@@ -4036,8 +4132,6 @@
           <w:b/>
           <w:spacing w:val="0"/>
         </w:rPr>
-        <w:t xml:space="preserve">BAB V</w:t>
-        <w:br/>
         <w:t xml:space="preserve">KESIMPULAN DAN SARAN</w:t>
       </w:r>
     </w:p>

</xml_diff>